<commit_message>
Add commercial rules for custom orders to knowledge base
New "ORDINI CUSTOM - REGOLE COMMERCIALI" section: minimum order (10 pcs
per model; rashguard mixes sizes+colors, kimono minimum is per color),
pricing via the client's private price list on kanokimonos.app (bot never
quotes prices; super-VIP excepted), how to modify existing orders per
channel/customer type, size advice bound to the official size chart,
pre-delivery photos policy, and the 45-60 business-day lead time.

Reimport to Neon via /import-knowledge follows this deploy.

Co-Authored-By: Claude Opus 4.8 (1M context) <noreply@anthropic.com>
</commit_message>
<xml_diff>
--- a/manuale_operativo.docx
+++ b/manuale_operativo.docx
@@ -7937,6 +7937,40 @@
         <w:t>File finale per il cliente: due viste, una con le misure (in rosso) e una pulita, sempre con nota che la base è un A2.</w:t>
         <w:br/>
         <w:t>I designer NON discutono mai prezzi o dettagli commerciali col cliente: qualsiasi tema di costo va girato a Mauro.</w:t>
+      </w:r>
+    </w:p>
+    <w:p/>
+    <w:p>
+      <w:r>
+        <w:t>ORDINI CUSTOM - REGOLE COMMERCIALI</w:t>
+        <w:br/>
+        <w:br/>
+        <w:t>MINIMO D'ORDINE: 10 pezzi dello stesso modello.</w:t>
+        <w:br/>
+        <w:t>- Rashguard: 10 pezzi stesso modello, taglie diverse E colori diversi ammessi nello stesso minimo.</w:t>
+        <w:br/>
+        <w:t>- Kimono: 10 pezzi stesso modello, taglie diverse ammesse, MA i colori NON si mischiano: ogni colore fa minimo a sé (es. 10 neri taglie miste + 10 blu taglie miste + 10 bianchi taglie miste).</w:t>
+        <w:br/>
+        <w:br/>
+        <w:t>PREZZI E PATCH: i prezzi di tutti gli articoli (patch incluse) sono nel listino personale del cliente, nell'area privata su kanokimonos.app. Il bot non comunica prezzi: rimanda il cliente al suo listino nell'area privata. Eccezione: i clienti super-VIP non vedono i prezzi sul sito perché sono già stati comunicati e concordati direttamente.</w:t>
+        <w:br/>
+        <w:br/>
+        <w:t>MODIFICHE A ORDINI GIÀ FATTI:</w:t>
+        <w:br/>
+        <w:t>- Su kanokimonos.app (custom): il cliente può aggiungere prodotti direttamente dal sito.</w:t>
+        <w:br/>
+        <w:t>- Su kanokimonos.com, cliente B2B: si cancella l'ordine vecchio e se ne fa uno nuovo. Il cliente deve rifare l'ordine.</w:t>
+        <w:br/>
+        <w:t>- Su kanokimonos.com, cliente retail: le modifiche le facciamo noi internamente e la differenza si paga tramite link di pagamento con carta di credito.</w:t>
+        <w:br/>
+        <w:br/>
+        <w:t>CONSIGLI TAGLIE: si possono suggerire taglie in base ad altezza e peso, restando SEMPRE fedeli alla tabella taglie ufficiale. Mai inventare misure fuori tabella.</w:t>
+        <w:br/>
+        <w:br/>
+        <w:t>FOTO PRODOTTI PRE-CONSEGNA: i prodotti vengono fotografati solo in fabbrica durante la creazione del sample, prima della produzione. Le foto si girano ai clienti solo occasionalmente in base alle esigenze: NON è una prassi di routine e non va promessa.</w:t>
+        <w:br/>
+        <w:br/>
+        <w:t>TEMPI DI CONSEGNA ORDINI CUSTOM: 45-60 giorni lavorativi dal pagamento dell'acconto. Il bot dà sempre prima questa informazione standard; per dettagli oltre questa, rimanda a Mauro.</w:t>
       </w:r>
     </w:p>
     <w:sectPr>

</xml_diff>

<commit_message>
Split delivery times by product type (custom vs catalog)
Rule 10 and the manual's delivery block previously stated only the custom
45-60 day lead time as if universal. Now they distinguish:
- Custom (kanokimonos.app): 45-60 business days from the deposit payment
- Catalog (kanokimonos.com): 2-3 days in Italy, 5-6 days in Europe
and instruct to ask which type when unclear.

Applied to both SYSTEM_PROMPT (rule 10) and manuale_operativo.docx;
reimport to Neon follows this deploy.

Co-Authored-By: Claude Opus 4.8 (1M context) <noreply@anthropic.com>
</commit_message>
<xml_diff>
--- a/manuale_operativo.docx
+++ b/manuale_operativo.docx
@@ -7970,7 +7970,13 @@
         <w:t>FOTO PRODOTTI PRE-CONSEGNA: i prodotti vengono fotografati solo in fabbrica durante la creazione del sample, prima della produzione. Le foto si girano ai clienti solo occasionalmente in base alle esigenze: NON è una prassi di routine e non va promessa.</w:t>
         <w:br/>
         <w:br/>
-        <w:t>TEMPI DI CONSEGNA ORDINI CUSTOM: 45-60 giorni lavorativi dal pagamento dell'acconto. Il bot dà sempre prima questa informazione standard; per dettagli oltre questa, rimanda a Mauro.</w:t>
+        <w:t>TEMPI DI CONSEGNA: dipendono dal tipo di prodotto.</w:t>
+        <w:br/>
+        <w:t>- Prodotti custom (kanokimonos.app): 45-60 giorni lavorativi dal pagamento dell'acconto. Alla domanda sui tempi di un custom si dà SEMPRE prima questa informazione; per dettagli oltre questa, rimanda a Mauro.</w:t>
+        <w:br/>
+        <w:t>- Prodotti da catalogo (kanokimonos.com): spedizione 2-3 giorni in Italia, 5-6 giorni in Europa.</w:t>
+        <w:br/>
+        <w:t>Se non è chiaro di quale tipo si tratta, chiedi se è un ordine custom o da catalogo.</w:t>
       </w:r>
     </w:p>
     <w:sectPr>

</xml_diff>

<commit_message>
Add extra-EU duties rule, photo/defect/price conduct rules, fix search-knowledge
- Manual: add SPEDIZIONI EXTRA-UE rule (duties always on the customer)
- SYSTEM_PROMPT: never promise pre-delivery photos; confirm replacement
  immediately on defect reports; never offer to "create a quote", always
  point to the personal price list
- /search-knowledge: read all manuale chunks with per-word matching
  (mirror get_knowledge_context) so it's a reliable diagnostic endpoint

Co-Authored-By: Claude Opus 4.8 (1M context) <noreply@anthropic.com>
</commit_message>
<xml_diff>
--- a/manuale_operativo.docx
+++ b/manuale_operativo.docx
@@ -7977,6 +7977,11 @@
         <w:t>- Prodotti da catalogo (kanokimonos.com): spedizione 2-3 giorni in Italia, 5-6 giorni in Europa.</w:t>
         <w:br/>
         <w:t>Se non è chiaro di quale tipo si tratta, chiedi se è un ordine custom o da catalogo.</w:t>
+      </w:r>
+    </w:p>
+    <w:p>
+      <w:r>
+        <w:t>SPEDIZIONI EXTRA-UE (Brasile, Svizzera, UK, ecc.): spediamo in tutto il mondo. I dazi doganali e le tasse di importazione sono SEMPRE a carico del cliente, secondo il regime fiscale del paese di destinazione. Questa regola va comunicata chiaramente al cliente prima dell'ordine.</w:t>
       </w:r>
     </w:p>
     <w:sectPr>

</xml_diff>

<commit_message>
Fix order minimums: 10 pcs/model for all incl. patches, belts min 100
- Correct the wrong "20 pcs" patch minimum everywhere: patches (catalog,
  standard, DTF) now follow the universal 10-pcs-same-model minimum
- Add the sole exception: belts, minimum 100 pieces total (colors/sizes
  freely mixable)
- Add small-quantity price warning (10 pcs far less convenient than 20)
- SYSTEM_PROMPT + manual MINIMO section + Team Gi email templates all
  made consistent (10 narrative "at least 20 patches" -> 10)

Co-Authored-By: Claude Opus 4.8 (1M context) <noreply@anthropic.com>
</commit_message>
<xml_diff>
--- a/manuale_operativo.docx
+++ b/manuale_operativo.docx
@@ -1172,7 +1172,7 @@
     </w:p>
     <w:p>
       <w:r>
-        <w:t>You purchase a batch of at least 20 custom patches (production takes 45-60 days).</w:t>
+        <w:t>You purchase a batch of at least 10 custom patches (production takes 45-60 days).</w:t>
       </w:r>
     </w:p>
     <w:p>
@@ -1614,8 +1614,7 @@
     </w:p>
     <w:p>
       <w:r>
-        <w:lastRenderedPageBreak/>
-        <w:t>You order at least 20 custom patches (production takes 45–60 days)</w:t>
+        <w:t>You order at least 10 custom patches (production takes 45–60 days)</w:t>
       </w:r>
     </w:p>
     <w:p>
@@ -2516,7 +2515,7 @@
     </w:p>
     <w:p>
       <w:r>
-        <w:t>You purchase a batch of at least 20 custom patches (production takes 45-60 days).</w:t>
+        <w:t>You purchase a batch of at least 10 custom patches (production takes 45-60 days).</w:t>
       </w:r>
     </w:p>
     <w:p>
@@ -3194,7 +3193,7 @@
     </w:p>
     <w:p>
       <w:r>
-        <w:t>Acquisti un lotto di almeno 20 patch personalizzate (produzione 45-60 giorni).</w:t>
+        <w:t>Acquisti un lotto di almeno 10 patch personalizzate (produzione 45-60 giorni).</w:t>
       </w:r>
     </w:p>
     <w:p>
@@ -3358,7 +3357,7 @@
     </w:p>
     <w:p>
       <w:r>
-        <w:t>Acquisti un lotto di almeno 20 patch personalizzate (la produzione richiede 45-60 giorni)</w:t>
+        <w:t>Acquisti un lotto di almeno 10 patch personalizzate (la produzione richiede 45-60 giorni)</w:t>
       </w:r>
     </w:p>
     <w:p>
@@ -4067,7 +4066,7 @@
     </w:p>
     <w:p>
       <w:r>
-        <w:t>Acquisti almeno 20 patch personalizzate (produzione: 45–60 giorni)</w:t>
+        <w:t>Acquisti almeno 10 patch personalizzate (produzione: 45–60 giorni)</w:t>
       </w:r>
     </w:p>
     <w:p>
@@ -5270,7 +5269,7 @@
     </w:p>
     <w:p>
       <w:r>
-        <w:t>Acquisti almeno 20 patch personalizzate (produzione: 45–60 giorni)</w:t>
+        <w:t>Acquisti almeno 10 patch personalizzate (produzione: 45–60 giorni)</w:t>
       </w:r>
     </w:p>
     <w:p>
@@ -5892,8 +5891,7 @@
     </w:p>
     <w:p>
       <w:r>
-        <w:lastRenderedPageBreak/>
-        <w:t>Acquisti un lotto di almeno 20 patch personalizzate (produzione 45-60 giorni).</w:t>
+        <w:t>Acquisti un lotto di almeno 10 patch personalizzate (produzione 45-60 giorni).</w:t>
       </w:r>
     </w:p>
     <w:p>
@@ -7068,7 +7066,7 @@
     </w:p>
     <w:p>
       <w:r>
-        <w:t>Acquisti almeno 20 patch personalizzate (produzione: 45–60 giorni)</w:t>
+        <w:t>Acquisti almeno 10 patch personalizzate (produzione: 45–60 giorni)</w:t>
       </w:r>
     </w:p>
     <w:p>
@@ -7692,7 +7690,7 @@
     </w:p>
     <w:p>
       <w:r>
-        <w:t>Acquisti un lotto di almeno 20 patch personalizzate (produzione 45-60 giorni).</w:t>
+        <w:t>Acquisti un lotto di almeno 10 patch personalizzate (produzione 45-60 giorni).</w:t>
       </w:r>
     </w:p>
     <w:p>
@@ -7945,11 +7943,15 @@
         <w:t>ORDINI CUSTOM - REGOLE COMMERCIALI</w:t>
         <w:br/>
         <w:br/>
-        <w:t>MINIMO D'ORDINE: 10 pezzi dello stesso modello.</w:t>
+        <w:t>MINIMO D'ORDINE: 10 pezzi dello stesso modello per TUTTI i prodotti (kimono, rashguard, shorts, t-shirt, felpe, patch da catalogo incluse). UNICA ECCEZIONE: le CINTURE, minimo 100 pezzi totali (colori e taglie mischiabili liberamente nel totale).</w:t>
         <w:br/>
         <w:t>- Rashguard: 10 pezzi stesso modello, taglie diverse E colori diversi ammessi nello stesso minimo.</w:t>
         <w:br/>
         <w:t>- Kimono: 10 pezzi stesso modello, taglie diverse ammesse, MA i colori NON si mischiano: ogni colore fa minimo a sé (es. 10 neri taglie miste + 10 blu taglie miste + 10 bianchi taglie miste).</w:t>
+        <w:br/>
+        <w:t>- Patch da catalogo: minimo 10 pezzi come gli altri prodotti (NON 20).</w:t>
+        <w:br/>
+        <w:t>- Attenzione ai piccoli quantitativi: il prezzo unitario cambia con la quantità, 10 pezzi è molto meno conveniente di 20. Prezzi esatti nel listino personale del cliente su kanokimonos.app.</w:t>
         <w:br/>
         <w:br/>
         <w:t>PREZZI E PATCH: i prezzi di tutti gli articoli (patch incluse) sono nel listino personale del cliente, nell'area privata su kanokimonos.app. Il bot non comunica prezzi: rimanda il cliente al suo listino nell'area privata. Eccezione: i clienti super-VIP non vedono i prezzi sul sito perché sono già stati comunicati e concordati direttamente.</w:t>

</xml_diff>

<commit_message>
Add official size guide + parametric user roles (staff/b2b/retail)
- Manual: GUIDA TAGLIE UFFICIALE block (kids kimono/rash/shorts, adult GI
  height×weight matrix A0-A5 incl. long/short variants, adult shorts/rash
  XS-XXL rule, worked examples, tie-break by preferred fit)
- SYSTEM_PROMPT: rule 12 — suggest only sizes read from the guide, never
  eyeball; always call rispondi_dal_manuale for size questions
- SYSTEM_PROMPT: MODALITA UTENTE section documenting the three roles
- Role parameter on /chat (default "staff"): selects the active prompt
  block and filters the tool list passed to Haiku. b2b/retail predisposed
  but not activated; webchat stays staff. Platform blocking enforced at
  execution (defense in depth): b2b no btoweb, retail no order tools

Co-Authored-By: Claude Opus 4.8 (1M context) <noreply@anthropic.com>
</commit_message>
<xml_diff>
--- a/manuale_operativo.docx
+++ b/manuale_operativo.docx
@@ -7984,6 +7984,90 @@
     <w:p>
       <w:r>
         <w:t>SPEDIZIONI EXTRA-UE (Brasile, Svizzera, UK, ecc.): spediamo in tutto il mondo. I dazi doganali e le tasse di importazione sono SEMPRE a carico del cliente, secondo il regime fiscale del paese di destinazione. Questa regola va comunicata chiaramente al cliente prima dell'ordine.</w:t>
+      </w:r>
+    </w:p>
+    <w:p>
+      <w:r>
+        <w:t>GUIDA TAGLIE UFFICIALE (Kano Kimonos Unified Size Guide)</w:t>
+        <w:br/>
+        <w:t>Regola: suggerisci sempre la taglia leggendola da questa guida, mai a occhio. In caso di dubbio tra due taglie, scegli in base al fit preferito (aderente = taglia minore, comodo = taglia maggiore).</w:t>
+        <w:br/>
+        <w:br/>
+        <w:t>KIDS - KIMONO (Gi bambino): sigla = altezza / eta</w:t>
+        <w:br/>
+        <w:t>- M000 = 90 cm / 2-3 anni</w:t>
+        <w:br/>
+        <w:t>- M00 = 100 cm / 3-4 anni</w:t>
+        <w:br/>
+        <w:t>- M0 = 110 cm / 4-5 anni</w:t>
+        <w:br/>
+        <w:t>- M1 = 120 cm / 5-6 anni</w:t>
+        <w:br/>
+        <w:t>- M2 = 130 cm / 7-8 anni</w:t>
+        <w:br/>
+        <w:t>- M3 = 140 cm / 9-10 anni</w:t>
+        <w:br/>
+        <w:t>- M4 = 150 cm / 10-11 anni</w:t>
+        <w:br/>
+        <w:t>- M5 = 160 cm / 11-12 anni</w:t>
+        <w:br/>
+        <w:br/>
+        <w:t>KIDS - RASHGUARD: taglia = eta / lunghezza A (cm) / torace B (cm)</w:t>
+        <w:br/>
+        <w:t>- S = 5-6 anni / A 47 / B 30</w:t>
+        <w:br/>
+        <w:t>- M = 7-8 anni / A 51 / B 32</w:t>
+        <w:br/>
+        <w:t>- L = 9-10 anni / A 55 / B 35</w:t>
+        <w:br/>
+        <w:t>- XL = 11-12 anni / A 59 / B 39</w:t>
+        <w:br/>
+        <w:br/>
+        <w:t>KIDS - SHORTS: taglia = eta / vita A (cm) / gamba B (cm)</w:t>
+        <w:br/>
+        <w:t>- S = 5-6 anni / vita 30 / gamba 29</w:t>
+        <w:br/>
+        <w:t>- M = 7-8 anni / vita 32 / gamba 32</w:t>
+        <w:br/>
+        <w:t>- L = 9-10 anni / vita 36 / gamba 35</w:t>
+        <w:br/>
+        <w:t>- XL = 11-12 anni / vita 40 / gamba 38</w:t>
+        <w:br/>
+        <w:br/>
+        <w:t>GI ADULTO (Gi BJJ): scegli in base ad altezza (cm) e peso (kg). Varianti: L = long (piu lungo), S = short (piu corto).</w:t>
+        <w:br/>
+        <w:t>- Altezza 150-160 cm: A0 fino a 55 kg | A1 60-70 kg | A2 75-90 kg | A3S 100-120 kg | A4 130 kg</w:t>
+        <w:br/>
+        <w:t>- Altezza 165 cm: A1 fino a 70 kg | A2 75-90 kg | A3S 100-120 kg | A4 130 kg</w:t>
+        <w:br/>
+        <w:t>- Altezza 170-175 cm: A1L fino a 70 kg | A2 75-90 kg | A3S 100-120 kg | A4 130 kg</w:t>
+        <w:br/>
+        <w:t>- Altezza 180 cm: A2 fino a 70 kg | A2L 75-90 kg | A3S 100-120 kg | A4 130 kg</w:t>
+        <w:br/>
+        <w:t>- Altezza 185 cm: A2L fino a 90 kg | A3 100-120 kg | A4 130 kg</w:t>
+        <w:br/>
+        <w:t>- Altezza 190 cm: A3 fino a 110 kg | A4 120-130 kg</w:t>
+        <w:br/>
+        <w:t>- Altezza 195 cm: A4 fino a 120 kg | A5 130 kg</w:t>
+        <w:br/>
+        <w:t>- Altezza 200 cm: A5 per tutti i pesi</w:t>
+        <w:br/>
+        <w:br/>
+        <w:t>SHORTS e RASHGUARD ADULTO: taglie XS-XXL in base al peso, con la statura che sposta di una taglia (piu alto = una taglia in piu).</w:t>
+        <w:br/>
+        <w:t>- Sotto 65 kg: XS-S (XS statura bassa/media, S statura alta circa 170 cm o piu)</w:t>
+        <w:br/>
+        <w:t>- 65-75 kg: S-M</w:t>
+        <w:br/>
+        <w:t>- 75-80 kg: M-L</w:t>
+        <w:br/>
+        <w:t>- 80-90 kg: L-XL</w:t>
+        <w:br/>
+        <w:t>- 100 kg e oltre: XL-XXL</w:t>
+        <w:br/>
+        <w:t>Esempio: donna 174 cm / 60 kg -&gt; rashguard S (sotto 65 kg + statura alta) e GI A1L (altezza 170-175 cm, fino a 70 kg).</w:t>
+        <w:br/>
+        <w:t>Esempio: uomo 180 cm / 85 kg -&gt; GI A2L (altezza 180 cm, peso 75-90 kg).</w:t>
       </w:r>
     </w:p>
     <w:sectPr>

</xml_diff>

<commit_message>
Refine size advice: indication not certainty, explain L/S kimono variants
- SYSTEM_PROMPT rule 12: sizes are always an indication, never a certainty;
  ban words like "perfetta"/"esatta"; note the guide only crosses height×
  weight (individual proportions matter); on a boundary weight/height,
  propose BOTH sizes and explain the difference
- Manual GUIDA TAGLIE: explain L (Long) and S (Short) kimono variants
  (same width/shoulders, only lengths change)

Co-Authored-By: Claude Opus 4.8 (1M context) <noreply@anthropic.com>
</commit_message>
<xml_diff>
--- a/manuale_operativo.docx
+++ b/manuale_operativo.docx
@@ -8068,6 +8068,11 @@
         <w:t>Esempio: donna 174 cm / 60 kg -&gt; rashguard S (sotto 65 kg + statura alta) e GI A1L (altezza 170-175 cm, fino a 70 kg).</w:t>
         <w:br/>
         <w:t>Esempio: uomo 180 cm / 85 kg -&gt; GI A2L (altezza 180 cm, peso 75-90 kg).</w:t>
+      </w:r>
+    </w:p>
+    <w:p>
+      <w:r>
+        <w:t>VARIANTI KIMONO L (Long) e S (Short): la variante L (es. A2L rispetto ad A2) ha le STESSE spalle e larghezza della taglia base; cambiano solo: maniche leggermente piu lunghe, bottom della giacca leggermente piu lungo, pantaloni leggermente piu lunghi. E indicata per chi ha braccia o gambe piu lunghe della media a parita di corporatura. La variante S (es. A3S) e il contrario: stessa larghezza, lunghezze ridotte, per corporature robuste ma non alte.</w:t>
       </w:r>
     </w:p>
     <w:sectPr>

</xml_diff>

<commit_message>
Dire al manuale chi spedisce, e che le special edition sono catalogo
Blocco nuovo in coda al docx: la merce al cliente la spedisce sempre
Fully, cambia solo la strada prima (custom passa dalla fabbrica, catalogo
no) e quanti destinatari ci sono dopo. Le special edition si trattano
come catalogo: il giro custom manda tutto a UN solo cliente, una special
edition va a OGNI cliente che la ordina.

Verificato prima del commit: il titolo tutto maiuscolo e' un confine
valido per _e_titolo_sezione, le 77 sezioni preesistenti restano
identiche byte per byte (APPROVAZIONE DEL PAGAMENTO 565 car. invariata) e
get_size_guide_block si ferma dove si fermava (2484 car.).

Co-Authored-By: Claude Fable 5 <noreply@anthropic.com>
</commit_message>
<xml_diff>
--- a/manuale_operativo.docx
+++ b/manuale_operativo.docx
@@ -8140,6 +8140,32 @@
         <w:t>- Prodotti custom (kanokimonos.app): si inseriscono gli importi ricevuti, distinguendo acconto e saldo, nella sezione "documentazione amministrativa" dell'ordine specifico. Il sistema tiene il conto di tutto da solo.</w:t>
         <w:br/>
         <w:t>Una cosa resta manuale e la fa l'operatore: inserire il produttore che svolgera' il lavoro.</w:t>
+      </w:r>
+    </w:p>
+    <w:p/>
+    <w:p>
+      <w:r>
+        <w:t>FLUSSI DI SPEDIZIONE: CUSTOM, CATALOGO E SPECIAL EDITION</w:t>
+        <w:br/>
+        <w:br/>
+        <w:t>Chi spedisce la merce al cliente e' sempre Fully. Quello che cambia e' la strada che la merce fa PRIMA di arrivare a Fully, e quanti destinatari ci sono dopo.</w:t>
+        <w:br/>
+        <w:br/>
+        <w:t>PRODOTTI CUSTOM (kanokimonos.app)</w:t>
+        <w:br/>
+        <w:t>Un ordine custom nasce sul punto app con i quantitativi e UN indirizzo, quello del cliente che lo ha ordinato. L'ordine va alla fabbrica, che produce; poi la fabbrica manda un carico a Fully con degli SKU che Fully riconosce e UN SOLO indirizzo verso cui spedire tutto.</w:t>
+        <w:br/>
+        <w:t>La catena e': kanokimonos.app -&gt; fabbrica -&gt; Fully -&gt; un solo cliente.</w:t>
+        <w:br/>
+        <w:br/>
+        <w:t>PRODOTTI DA CATALOGO (kanokimonos.com)</w:t>
+        <w:br/>
+        <w:t>Qui la fabbrica non c'entra. Il sito manda a Fully direttamente gli SKU che Fully ha gia' nei suoi scaffali, con l'indirizzo di quel singolo ordine. La catena e': kanokimonos.com -&gt; Fully -&gt; cliente. La fabbrica si salta.</w:t>
+        <w:br/>
+        <w:br/>
+        <w:t>SPECIAL EDITION: SI TRATTANO COME PRODOTTI DA CATALOGO</w:t>
+        <w:br/>
+        <w:t>Le special edition sono prodotti in edizione limitata che il cliente compra dal sito. Siccome sono prodotti speciali, qualcuno potrebbe pensare che convenga trattarle con il giro dei prodotti custom: NON e' cosi', ed e' un errore da evitare. Il motivo e' semplice: il giro custom prevede l'invio di tutto il materiale a UN SOLO cliente, mentre di una special edition va inviato un prodotto a OGNI cliente che lo ordina. Quindi una special edition si tratta come un prodotto da catalogo, in tutto e per tutto: le si assegnano SKU permanenti, la fabbrica la produce, la fabbrica invia il carico a Fully, Fully processa il carico e da quel momento puo' evadere tutti gli indirizzi di chi ha ordinato dal sito kanokimonos.com. Se ci si pensa, una special edition E' un prodotto da catalogo a tutti gli effetti: e' solo il nome "special edition" che puo' trarre in inganno.</w:t>
       </w:r>
     </w:p>
     <w:sectPr>

</xml_diff>

<commit_message>
Togliere il maiuscolo ai sottotitoli, cosi' il blocco resta uno
I tre sottotitoli del blocco spedizioni erano tutti maiuscoli, quindi
_e_titolo_sezione li leggeva come confini e spezzava il blocco in quattro
sezioni da 215/374/260/923 caratteri. Siccome la consegna porta al
massimo due sezioni, alla domanda "come funziona la spedizione di un
ordine custom?" la catena kanokimonos.app -> fabbrica -> Fully -> un solo
cliente non arrivava mai al modello: vinceva TRACKING ORDINI E
SPEDIZIONI e il blocco nuovo restava fuori.

Riscritte solo quelle tre righe in forma non-titolo, testo identico. Il
titolo del blocco resta maiuscolo ed e' l'unico confine.

Verificato: sezioni 81 -> 78, il blocco e' una sezione sola di 1778
caratteri (sotto CAP_SEZIONE) che contiene tutte e tre le catene, le 77
sezioni preesistenti restano identiche byte per byte e
get_size_guide_block resta a 2484 caratteri.

Co-Authored-By: Claude Fable 5 <noreply@anthropic.com>
</commit_message>
<xml_diff>
--- a/manuale_operativo.docx
+++ b/manuale_operativo.docx
@@ -8151,19 +8151,19 @@
         <w:t>Chi spedisce la merce al cliente e' sempre Fully. Quello che cambia e' la strada che la merce fa PRIMA di arrivare a Fully, e quanti destinatari ci sono dopo.</w:t>
         <w:br/>
         <w:br/>
-        <w:t>PRODOTTI CUSTOM (kanokimonos.app)</w:t>
+        <w:t>Prodotti custom (kanokimonos.app):</w:t>
         <w:br/>
         <w:t>Un ordine custom nasce sul punto app con i quantitativi e UN indirizzo, quello del cliente che lo ha ordinato. L'ordine va alla fabbrica, che produce; poi la fabbrica manda un carico a Fully con degli SKU che Fully riconosce e UN SOLO indirizzo verso cui spedire tutto.</w:t>
         <w:br/>
         <w:t>La catena e': kanokimonos.app -&gt; fabbrica -&gt; Fully -&gt; un solo cliente.</w:t>
         <w:br/>
         <w:br/>
-        <w:t>PRODOTTI DA CATALOGO (kanokimonos.com)</w:t>
+        <w:t>Prodotti da catalogo (kanokimonos.com):</w:t>
         <w:br/>
         <w:t>Qui la fabbrica non c'entra. Il sito manda a Fully direttamente gli SKU che Fully ha gia' nei suoi scaffali, con l'indirizzo di quel singolo ordine. La catena e': kanokimonos.com -&gt; Fully -&gt; cliente. La fabbrica si salta.</w:t>
         <w:br/>
         <w:br/>
-        <w:t>SPECIAL EDITION: SI TRATTANO COME PRODOTTI DA CATALOGO</w:t>
+        <w:t>Special edition: si trattano come prodotti da catalogo.</w:t>
         <w:br/>
         <w:t>Le special edition sono prodotti in edizione limitata che il cliente compra dal sito. Siccome sono prodotti speciali, qualcuno potrebbe pensare che convenga trattarle con il giro dei prodotti custom: NON e' cosi', ed e' un errore da evitare. Il motivo e' semplice: il giro custom prevede l'invio di tutto il materiale a UN SOLO cliente, mentre di una special edition va inviato un prodotto a OGNI cliente che lo ordina. Quindi una special edition si tratta come un prodotto da catalogo, in tutto e per tutto: le si assegnano SKU permanenti, la fabbrica la produce, la fabbrica invia il carico a Fully, Fully processa il carico e da quel momento puo' evadere tutti gli indirizzi di chi ha ordinato dal sito kanokimonos.com. Se ci si pensa, una special edition E' un prodotto da catalogo a tutti gli effetti: e' solo il nome "special edition" che puo' trarre in inganno.</w:t>
       </w:r>

</xml_diff>

<commit_message>
Dire quando si paga tutto e quando basta l'acconto
Co-Authored-By: Claude Opus 5 (1M context) <noreply@anthropic.com>
</commit_message>
<xml_diff>
--- a/manuale_operativo.docx
+++ b/manuale_operativo.docx
@@ -8178,6 +8178,41 @@
       <w:cols w:space="720"/>
       <w:docGrid w:linePitch="360"/>
     </w:sectPr>
+    <w:p/>
+    <w:p>
+      <w:r>
+        <w:t>QUANDO SI PAGA: ACCONTO O SALDO TOTALE</w:t>
+        <w:br/>
+        <w:br/>
+        <w:t>Prima che i lavori partano il cliente deve pagare, e quanto deve pagare dipende dall'importo del preventivo.</w:t>
+        <w:br/>
+        <w:br/>
+        <w:t>Sotto i 1000 euro: serve il SALDO TOTALE. Con un preventivo sotto questa cifra non si lavora con l'acconto: i lavori partono solo a pagamento completo.</w:t>
+        <w:br/>
+        <w:t>Sopra i 1000 euro: 50% di acconto per far partire i lavori, e il restante 50% al saldo.</w:t>
+        <w:br/>
+        <w:br/>
+        <w:t>Dove sta il preventivo: viene caricato nell'AREA DOCUMENTI dell'ordine, ed e' li' che il cliente lo trova. Prima di pagare il cliente deve controllare che sia tutto corretto.</w:t>
+        <w:br/>
+        <w:br/>
+        <w:t>Causale del bonifico, caso per caso:</w:t>
+        <w:br/>
+        <w:t>- acconto quando esiste solo il preventivo: la parola "advance" seguita dal numero del preventivo;</w:t>
+        <w:br/>
+        <w:t>- acconto quando la fattura e' gia' stata emessa: il numero della fattura;</w:t>
+        <w:br/>
+        <w:t>- saldo: sempre il numero della fattura, perche' al saldo la fattura viene presentata direttamente.</w:t>
+        <w:br/>
+        <w:t>Di norma si fa prima il preventivo e la fattura arriva dopo il pagamento, ma in alcuni casi il cliente chiede la fattura subito: da quel momento in causale va il numero della fattura e non piu' quello del preventivo.</w:t>
+        <w:br/>
+        <w:br/>
+        <w:t>Cosa deve fare il cliente PRIMA di pagare:</w:t>
+        <w:br/>
+        <w:t>- se vuole la fattura con partita IVA, deve aggiornare i suoi dati nel sito: la fatturazione legge l'anagrafica del sito, quindi se la partita IVA non c'e' a sistema la fattura non parte;</w:t>
+        <w:br/>
+        <w:t>- se vuole ricevere la merce a un indirizzo diverso da quello usato per l'iscrizione, deve aggiornare l'indirizzo nel sito, sempre prima che l'ordine parta.</w:t>
+      </w:r>
+    </w:p>
   </w:body>
 </w:document>
 </file>

</xml_diff>

<commit_message>
Il retail riavere i soldi, il B2B un coupon; e il JPEG non e' un no
Tre decisioni di Bambu portate sia nelle istruzioni del bot sia nel
manuale: rimborso in denaro al retail e coupon al B2B, raster accettato
con conversione a 25 euro invece del rifiuto, e l'ok sulla grafica che
non si somma ai 45-60 giorni perche' viene prima del preventivo.

Co-Authored-By: Claude Opus 5 (1M context) <noreply@anthropic.com>
</commit_message>
<xml_diff>
--- a/manuale_operativo.docx
+++ b/manuale_operativo.docx
@@ -8211,6 +8211,21 @@
         <w:t>- se vuole la fattura con partita IVA, deve aggiornare i suoi dati nel sito: la fatturazione legge l'anagrafica del sito, quindi se la partita IVA non c'e' a sistema la fattura non parte;</w:t>
         <w:br/>
         <w:t>- se vuole ricevere la merce a un indirizzo diverso da quello usato per l'iscrizione, deve aggiornare l'indirizzo nel sito, sempre prima che l'ordine parta.</w:t>
+      </w:r>
+    </w:p>
+    <w:p/>
+    <w:p>
+      <w:r>
+        <w:t>RIMBORSI, FILE GRAFICI E TEMPI DI PRODUZIONE</w:t>
+        <w:br/>
+        <w:br/>
+        <w:t>Rimborsi: al cliente retail si rimborsa in denaro senza problemi, se e' il rimborso che chiede. Al cliente B2B invece non si rimborsa in denaro: si emette un coupon che potra' usare sull'ordine successivo.</w:t>
+        <w:br/>
+        <w:br/>
+        <w:t>File grafici: il file che chiediamo e' il vettoriale. Se il cliente non ce l'ha, il file raster (JPEG, PNG) si accetta lo stesso e la conversione la facciamo noi, con un costo di 25 euro. Non rifiutare mai un ordine perche' il cliente ha solo un JPEG: si propone la conversione.</w:t>
+        <w:br/>
+        <w:br/>
+        <w:t>Tempi di produzione dei custom: 45-60 giorni dal pagamento. L'ok del cliente sulla grafica non allunga questi tempi e non va sommato: l'approvazione della grafica avviene sempre PRIMA, perche' senza quella non si procede nemmeno a fare il preventivo.</w:t>
       </w:r>
     </w:p>
   </w:body>

</xml_diff>

<commit_message>
Dire a chi si applica ogni regola: il rimborso, il raster, il conto dei giorni
Le righe che negavano il rimborso in denaro stavano tutte dentro
documenti B2B, ma senza dirlo: riscritte perche' si qualifichino da
sole, retail in denaro e B2B a coupon. Il rifiuto del raster diventa la
conversione a pagamento. E i giorni si contano dal pagamento che fa
partire i lavori, non dall'acconto ne' dall'ok sulla grafica, che viene
prima e non si somma.

Co-Authored-By: Claude Opus 5 (1M context) <noreply@anthropic.com>
</commit_message>
<xml_diff>
--- a/manuale_operativo.docx
+++ b/manuale_operativo.docx
@@ -120,7 +120,9 @@
       </w:r>
       <w:r>
         <w:br/>
-        <w:t>Approved refunds will be issued exclusively as store credit to be used for future orders. No cash refunds will be given.</w:t>
+        <w:t>Refunds depend on the type of customer. B2B customers (gyms, academies, sports associations, instructors), the customers these terms apply to, are not refunded in cash: an approved refund is issued as a coupon to be used on a future order.</w:t>
+        <w:br/>
+        <w:t>Retail customers (private individuals) are refunded in cash without difficulty, if a refund is what they ask for.</w:t>
       </w:r>
     </w:p>
     <w:p>
@@ -173,7 +175,7 @@
       </w:r>
       <w:r>
         <w:br/>
-        <w:t>• Estimated production: 45–60 working days from payment and graphic approval</w:t>
+        <w:t>• Estimated production: 45–60 working days from the payment that starts the work (the full balance under 1000 euro, the 50% deposit above)</w:t>
       </w:r>
       <w:r>
         <w:br/>
@@ -357,7 +359,7 @@
       </w:r>
       <w:r>
         <w:br/>
-        <w:t>• JPG or PNG files (even if saved as PDF) are not accepted, as they are not editable or suitable for printing</w:t>
+        <w:t>• If the customer only has raster files (JPG, PNG) we accept them anyway and convert them ourselves, for a cost of 25 euro: an order is never refused because the customer only has a JPEG</w:t>
       </w:r>
       <w:r>
         <w:br/>
@@ -594,7 +596,9 @@
       </w:r>
       <w:r>
         <w:br/>
-        <w:t>Approved refunds will be issued exclusively as a store credit to be used on a future order. No cash refunds are provided.</w:t>
+        <w:t>Refunds depend on the type of customer. B2B customers (gyms, academies, sports associations, instructors), the customers these terms apply to, are not refunded in cash: an approved refund is issued as a coupon to be used on a future order.</w:t>
+        <w:br/>
+        <w:t>Retail customers (private individuals) are refunded in cash without difficulty, if a refund is what they ask for.</w:t>
       </w:r>
     </w:p>
     <w:p>
@@ -655,7 +659,7 @@
     </w:p>
     <w:p>
       <w:r>
-        <w:t>Estimated production time: 45–60 business days from payment and graphic approval</w:t>
+        <w:t>Estimated production time: 45–60 business days from the payment that starts the work (the full balance under 1000 euro, the 50% deposit above)</w:t>
       </w:r>
     </w:p>
     <w:p>
@@ -1429,11 +1433,11 @@
       </w:r>
       <w:r>
         <w:br/>
-        <w:t>Approved refunds will be issued exclusively as store credit to be used for future purchases.</w:t>
-      </w:r>
-      <w:r>
-        <w:br/>
-        <w:t>No cash refunds will be given.</w:t>
+        <w:t>Refunds depend on the type of customer. B2B customers (gyms, academies, sports associations, instructors), the customers these terms apply to, are not refunded in cash: an approved refund is issued as a coupon to be used on a future order.</w:t>
+      </w:r>
+      <w:r>
+        <w:br/>
+        <w:t>Retail customers (private individuals) are refunded in cash without difficulty, if a refund is what they ask for.</w:t>
       </w:r>
     </w:p>
     <w:p>
@@ -1494,7 +1498,7 @@
     </w:p>
     <w:p>
       <w:r>
-        <w:t>Estimated production time: 45–60 working days from payment and graphic approval</w:t>
+        <w:t>Estimated production time: 45–60 working days from the payment that starts the work (the full balance under 1000 euro, the 50% deposit above)</w:t>
       </w:r>
     </w:p>
     <w:p>
@@ -1802,7 +1806,9 @@
       </w:r>
       <w:r>
         <w:br/>
-        <w:t>I rimborsi vengono emessi esclusivamente sotto forma di buono sconto da utilizzare su un ordine futuro. Non sono previsti rimborsi in denaro.</w:t>
+        <w:t>I rimborsi dipendono dal tipo di cliente. Al cliente B2B (palestre, accademie, ASD, istruttori) non si rimborsa in denaro: il rimborso approvato viene emesso come coupon da utilizzare sull'ordine successivo.</w:t>
+        <w:br/>
+        <w:t>Al cliente retail (privato) si rimborsa in denaro senza problemi, se e' il rimborso che chiede.</w:t>
       </w:r>
     </w:p>
     <w:p>
@@ -1858,7 +1864,7 @@
       </w:r>
       <w:r>
         <w:br/>
-        <w:t>• Produzione stimata: 45–60 giorni lavorativi dal pagamento e conferma grafica</w:t>
+        <w:t>• Produzione stimata: 45–60 giorni lavorativi dal pagamento che fa partire i lavori (il saldo totale sotto i 1000 euro, l'acconto del 50% sopra)</w:t>
       </w:r>
       <w:r>
         <w:br/>
@@ -3461,7 +3467,7 @@
       </w:r>
       <w:r>
         <w:br/>
-        <w:t>• Non sono ammessi JPG o PNG (anche se salvati in PDF): non sono modificabili e non adatti alla stampa.</w:t>
+        <w:t>• Se il cliente ha solo file raster (JPG, PNG) li accettiamo lo stesso e la conversione la facciamo noi, con un costo di 25 euro: un ordine non viene mai rifiutato perche' il cliente ha solo un JPEG</w:t>
       </w:r>
       <w:r>
         <w:br/>
@@ -3877,11 +3883,11 @@
       </w:r>
       <w:r>
         <w:br/>
-        <w:t>I rimborsi approvati saranno emessi esclusivamente come credito da utilizzare per futuri ordini.</w:t>
-      </w:r>
-      <w:r>
-        <w:br/>
-        <w:t>Non sono previsti rimborsi in denaro.</w:t>
+        <w:t>I rimborsi dipendono dal tipo di cliente. Al cliente B2B (palestre, accademie, ASD, istruttori) non si rimborsa in denaro: il rimborso approvato viene emesso come coupon da utilizzare sull'ordine successivo.</w:t>
+      </w:r>
+      <w:r>
+        <w:br/>
+        <w:t>Al cliente retail (privato) si rimborsa in denaro senza problemi, se e' il rimborso che chiede.</w:t>
       </w:r>
     </w:p>
     <w:p>
@@ -3941,7 +3947,7 @@
     </w:p>
     <w:p>
       <w:r>
-        <w:t>45–60 giorni lavorativi da pagamento e approvazione grafica</w:t>
+        <w:t>45–60 giorni lavorativi dal pagamento che fa partire i lavori (il saldo totale sotto i 1000 euro, l'acconto del 50% sopra)</w:t>
       </w:r>
     </w:p>
     <w:p>
@@ -5080,11 +5086,11 @@
       </w:r>
       <w:r>
         <w:br/>
-        <w:t>I rimborsi approvati saranno emessi esclusivamente come credito da utilizzare per futuri ordini.</w:t>
-      </w:r>
-      <w:r>
-        <w:br/>
-        <w:t>Non sono previsti rimborsi in denaro.</w:t>
+        <w:t>I rimborsi dipendono dal tipo di cliente. Al cliente B2B (palestre, accademie, ASD, istruttori) non si rimborsa in denaro: il rimborso approvato viene emesso come coupon da utilizzare sull'ordine successivo.</w:t>
+      </w:r>
+      <w:r>
+        <w:br/>
+        <w:t>Al cliente retail (privato) si rimborsa in denaro senza problemi, se e' il rimborso che chiede.</w:t>
       </w:r>
     </w:p>
     <w:p>
@@ -5144,7 +5150,7 @@
     </w:p>
     <w:p>
       <w:r>
-        <w:t>45–60 giorni lavorativi da pagamento e approvazione grafica</w:t>
+        <w:t>45–60 giorni lavorativi dal pagamento che fa partire i lavori (il saldo totale sotto i 1000 euro, l'acconto del 50% sopra)</w:t>
       </w:r>
     </w:p>
     <w:p>
@@ -5530,7 +5536,7 @@
       </w:r>
       <w:r>
         <w:br/>
-        <w:t>• Non sono ammessi JPG o PNG (anche se salvati in PDF): non sono modificabili e non adatti alla stampa.</w:t>
+        <w:t>• Se il cliente ha solo file raster (JPG, PNG) li accettiamo lo stesso e la conversione la facciamo noi, con un costo di 25 euro: un ordine non viene mai rifiutato perche' il cliente ha solo un JPEG</w:t>
       </w:r>
       <w:r>
         <w:br/>
@@ -6881,11 +6887,11 @@
       </w:r>
       <w:r>
         <w:br/>
-        <w:t>I rimborsi approvati saranno emessi esclusivamente come credito da utilizzare per futuri ordini.</w:t>
-      </w:r>
-      <w:r>
-        <w:br/>
-        <w:t>Non sono previsti rimborsi in denaro.</w:t>
+        <w:t>I rimborsi dipendono dal tipo di cliente. Al cliente B2B (palestre, accademie, ASD, istruttori) non si rimborsa in denaro: il rimborso approvato viene emesso come coupon da utilizzare sull'ordine successivo.</w:t>
+      </w:r>
+      <w:r>
+        <w:br/>
+        <w:t>Al cliente retail (privato) si rimborsa in denaro senza problemi, se e' il rimborso che chiede.</w:t>
       </w:r>
     </w:p>
     <w:p>
@@ -6946,7 +6952,7 @@
     </w:p>
     <w:p>
       <w:r>
-        <w:t>45–60 giorni lavorativi da pagamento e approvazione grafica</w:t>
+        <w:t>45–60 giorni lavorativi dal pagamento che fa partire i lavori (il saldo totale sotto i 1000 euro, l'acconto del 50% sopra)</w:t>
       </w:r>
     </w:p>
     <w:p>
@@ -7334,7 +7340,7 @@
       </w:r>
       <w:r>
         <w:br/>
-        <w:t>• Non sono ammessi JPG o PNG (anche se salvati in PDF): non sono modificabili e non adatti alla stampa.</w:t>
+        <w:t>• Se il cliente ha solo file raster (JPG, PNG) li accettiamo lo stesso e la conversione la facciamo noi, con un costo di 25 euro: un ordine non viene mai rifiutato perche' il cliente ha solo un JPEG</w:t>
       </w:r>
       <w:r>
         <w:br/>
@@ -7984,7 +7990,7 @@
         <w:br/>
         <w:t>TEMPI DI CONSEGNA: dipendono dal tipo di prodotto.</w:t>
         <w:br/>
-        <w:t>- Prodotti custom (kanokimonos.app): 45-60 giorni lavorativi dal pagamento dell'acconto. Alla domanda sui tempi di un custom si dà SEMPRE prima questa informazione; per dettagli oltre questa, rimanda a Mauro.</w:t>
+        <w:t>- Prodotti custom (kanokimonos.app): 45-60 giorni lavorativi dal pagamento che fa partire i lavori (il saldo totale sotto i 1000 euro, l'acconto del 50% sopra). Alla domanda sui tempi di un custom si dà SEMPRE prima questa informazione; per dettagli oltre questa, rimanda a Mauro.</w:t>
         <w:br/>
         <w:t>- Prodotti da catalogo (kanokimonos.com): spedizione 2-3 giorni in Italia, 5-6 giorni in Europa.</w:t>
         <w:br/>
@@ -8225,7 +8231,7 @@
         <w:t>File grafici: il file che chiediamo e' il vettoriale. Se il cliente non ce l'ha, il file raster (JPEG, PNG) si accetta lo stesso e la conversione la facciamo noi, con un costo di 25 euro. Non rifiutare mai un ordine perche' il cliente ha solo un JPEG: si propone la conversione.</w:t>
         <w:br/>
         <w:br/>
-        <w:t>Tempi di produzione dei custom: 45-60 giorni dal pagamento. L'ok del cliente sulla grafica non allunga questi tempi e non va sommato: l'approvazione della grafica avviene sempre PRIMA, perche' senza quella non si procede nemmeno a fare il preventivo.</w:t>
+        <w:t>Tempi di produzione dei custom: 45-60 giorni lavorativi dal pagamento che fa partire i lavori (il saldo totale sotto i 1000 euro, l'acconto del 50% sopra). L'ok del cliente sulla grafica non allunga questi tempi e non va sommato: l'approvazione della grafica avviene sempre PRIMA, perche' senza quella non si procede nemmeno a fare il preventivo.</w:t>
       </w:r>
     </w:p>
   </w:body>

</xml_diff>

<commit_message>
Venticinque euro a immagine, e il forfait lo decide chi gestisce l'ordine
La cifra era scritta in due modi diversi in otto punti: ora dicono tutti
25 euro a immagine, a logo. Aggiunta la frase da dire al cliente e, in
chiaro come informazione interna, che il forfait per piu' immagini si
valuta caso per caso e non lo promette il bot.

Co-Authored-By: Claude Opus 5 (1M context) <noreply@anthropic.com>
</commit_message>
<xml_diff>
--- a/manuale_operativo.docx
+++ b/manuale_operativo.docx
@@ -359,7 +359,7 @@
       </w:r>
       <w:r>
         <w:br/>
-        <w:t>• If the customer only has raster files (JPG, PNG) we accept them anyway and convert them ourselves, for a cost of 25 euro: an order is never refused because the customer only has a JPEG</w:t>
+        <w:t>• If the customer only has raster files (JPG, PNG) we accept them anyway and convert them ourselves, for a cost of 25 euro per image (per logo): an order is never refused because the customer only has a JPEG</w:t>
       </w:r>
       <w:r>
         <w:br/>
@@ -2258,7 +2258,7 @@
     </w:p>
     <w:p>
       <w:r>
-        <w:t>Immagini: Se dispone solo di immagini raster (JPEG, PNG), applicheremo un costo aggiuntivo di 25 euro per ogni immagine da convertire in formato vettoriale. Tuttavia, per immagini semplici e lineari, il nostro software è in grado di elaborarle senza costi aggiuntivi.</w:t>
+        <w:t>Immagini: Se dispone solo di immagini raster (JPEG, PNG), applicheremo un costo aggiuntivo di 25 euro a immagine (a logo) da convertire in formato vettoriale. Tuttavia, per immagini semplici e lineari, il nostro software è in grado di elaborarle senza costi aggiuntivi.</w:t>
       </w:r>
     </w:p>
     <w:p>
@@ -3467,7 +3467,7 @@
       </w:r>
       <w:r>
         <w:br/>
-        <w:t>• Se il cliente ha solo file raster (JPG, PNG) li accettiamo lo stesso e la conversione la facciamo noi, con un costo di 25 euro: un ordine non viene mai rifiutato perche' il cliente ha solo un JPEG</w:t>
+        <w:t>• Se il cliente ha solo file raster (JPG, PNG) li accettiamo lo stesso e la conversione la facciamo noi, con un costo di 25 euro a immagine (a logo): un ordine non viene mai rifiutato perche' il cliente ha solo un JPEG</w:t>
       </w:r>
       <w:r>
         <w:br/>
@@ -4697,7 +4697,7 @@
     </w:p>
     <w:p>
       <w:r>
-        <w:t>Immagini: Se dispone solo di immagini raster (JPEG, PNG), applicheremo un costo aggiuntivo di 25 euro per ogni immagine da convertire in formato vettoriale. Tuttavia, per immagini semplici e lineari, il nostro software è in grado di elaborarle senza costi aggiuntivi.</w:t>
+        <w:t>Immagini: Se dispone solo di immagini raster (JPEG, PNG), applicheremo un costo aggiuntivo di 25 euro a immagine (a logo) da convertire in formato vettoriale. Tuttavia, per immagini semplici e lineari, il nostro software è in grado di elaborarle senza costi aggiuntivi.</w:t>
       </w:r>
     </w:p>
     <w:p>
@@ -5536,7 +5536,7 @@
       </w:r>
       <w:r>
         <w:br/>
-        <w:t>• Se il cliente ha solo file raster (JPG, PNG) li accettiamo lo stesso e la conversione la facciamo noi, con un costo di 25 euro: un ordine non viene mai rifiutato perche' il cliente ha solo un JPEG</w:t>
+        <w:t>• Se il cliente ha solo file raster (JPG, PNG) li accettiamo lo stesso e la conversione la facciamo noi, con un costo di 25 euro a immagine (a logo): un ordine non viene mai rifiutato perche' il cliente ha solo un JPEG</w:t>
       </w:r>
       <w:r>
         <w:br/>
@@ -6499,7 +6499,7 @@
     </w:p>
     <w:p>
       <w:r>
-        <w:t>Immagini: Se dispone solo di immagini raster (JPEG, PNG), applicheremo un costo aggiuntivo di 25 euro per ogni immagine da convertire in formato vettoriale. Tuttavia, per immagini semplici e lineari, il nostro software è in grado di elaborarle senza costi aggiuntivi.</w:t>
+        <w:t>Immagini: Se dispone solo di immagini raster (JPEG, PNG), applicheremo un costo aggiuntivo di 25 euro a immagine (a logo) da convertire in formato vettoriale. Tuttavia, per immagini semplici e lineari, il nostro software è in grado di elaborarle senza costi aggiuntivi.</w:t>
       </w:r>
     </w:p>
     <w:p>
@@ -7340,7 +7340,7 @@
       </w:r>
       <w:r>
         <w:br/>
-        <w:t>• Se il cliente ha solo file raster (JPG, PNG) li accettiamo lo stesso e la conversione la facciamo noi, con un costo di 25 euro: un ordine non viene mai rifiutato perche' il cliente ha solo un JPEG</w:t>
+        <w:t>• Se il cliente ha solo file raster (JPG, PNG) li accettiamo lo stesso e la conversione la facciamo noi, con un costo di 25 euro a immagine (a logo): un ordine non viene mai rifiutato perche' il cliente ha solo un JPEG</w:t>
       </w:r>
       <w:r>
         <w:br/>
@@ -8228,7 +8228,11 @@
         <w:t>Rimborsi: al cliente retail si rimborsa in denaro senza problemi, se e' il rimborso che chiede. Al cliente B2B invece non si rimborsa in denaro: si emette un coupon che potra' usare sull'ordine successivo.</w:t>
         <w:br/>
         <w:br/>
-        <w:t>File grafici: il file che chiediamo e' il vettoriale. Se il cliente non ce l'ha, il file raster (JPEG, PNG) si accetta lo stesso e la conversione la facciamo noi, con un costo di 25 euro. Non rifiutare mai un ordine perche' il cliente ha solo un JPEG: si propone la conversione.</w:t>
+        <w:t>File grafici: il file che chiediamo e' il vettoriale. Se il cliente non ce l'ha, il file raster (JPEG, PNG) si accetta lo stesso e la conversione la facciamo noi, con un costo di 25 euro a immagine, cioe' a logo: tre loghi raster sono tre conversioni, 75 euro. Non rifiutare mai un ordine perche' il cliente ha solo un JPEG: si propone la conversione.</w:t>
+        <w:br/>
+        <w:t>Come dirlo al cliente, anche al cliente business: "e' previsto un costo di 25 euro a immagine, a logo. Se le immagini sono piu' d'una, di volta in volta valutiamo se c'e' la possibilita' di un forfait in base al tipo di progetto."</w:t>
+        <w:br/>
+        <w:t>Il forfait (informazione interna: rispondi solo allo staff): quando le immagini sono piu' di una si puo' valutare un forfait, caso per caso, in base al progetto. La decisione sullo sconto la prende chi gestisce l'ordine, non il bot: al cliente il forfait non si promette mai come se fosse un prezzo di listino, gli si dice che lo valutiamo.</w:t>
         <w:br/>
         <w:br/>
         <w:t>Tempi di produzione dei custom: 45-60 giorni lavorativi dal pagamento che fa partire i lavori (il saldo totale sotto i 1000 euro, l'acconto del 50% sopra). L'ok del cliente sulla grafica non allunga questi tempi e non va sommato: l'approvazione della grafica avviene sempre PRIMA, perche' senza quella non si procede nemmeno a fare il preventivo.</w:t>

</xml_diff>

<commit_message>
Su immagini e loghi il bot non parla a memoria: riporta alla lettera la frase del manuale, cifre comprese
Co-Authored-By: Claude Fable 5 <noreply@anthropic.com>
Claude-Session: https://claude.ai/code/session_01F1THjxSX7aepvyN8LpgLqZ
</commit_message>
<xml_diff>
--- a/manuale_operativo.docx
+++ b/manuale_operativo.docx
@@ -359,7 +359,7 @@
       </w:r>
       <w:r>
         <w:br/>
-        <w:t>• If the customer only has raster files (JPG, PNG) we accept them anyway and convert them ourselves, for a cost of 25 euro per image (per logo): an order is never refused because the customer only has a JPEG</w:t>
+        <w:t>• On file format and on the cost of converting raster images there is one single answer: the sentence in the manual block IMMAGINI E LOGHI: FORMATO E COSTO DI CONVERSIONE, reported word for word. No other figure is valid.</w:t>
       </w:r>
       <w:r>
         <w:br/>
@@ -2258,7 +2258,7 @@
     </w:p>
     <w:p>
       <w:r>
-        <w:t>Immagini: Se dispone solo di immagini raster (JPEG, PNG), applicheremo un costo aggiuntivo di 25 euro a immagine (a logo) da convertire in formato vettoriale. Tuttavia, per immagini semplici e lineari, il nostro software è in grado di elaborarle senza costi aggiuntivi.</w:t>
+        <w:t>Immagini: sul formato e sul costo della conversione si risponde solo con la frase del blocco IMMAGINI E LOGHI: FORMATO E COSTO DI CONVERSIONE, riportata parola per parola. Non usare altre cifre e non promettere lavorazioni gratuite: e' la frase stessa a dire cosa valutiamo e quando lo confermiamo.</w:t>
       </w:r>
     </w:p>
     <w:p>
@@ -3467,7 +3467,7 @@
       </w:r>
       <w:r>
         <w:br/>
-        <w:t>• Se il cliente ha solo file raster (JPG, PNG) li accettiamo lo stesso e la conversione la facciamo noi, con un costo di 25 euro a immagine (a logo): un ordine non viene mai rifiutato perche' il cliente ha solo un JPEG</w:t>
+        <w:t>• Sul formato dei file e sul costo della conversione delle immagini raster vale una sola risposta: la frase del blocco IMMAGINI E LOGHI: FORMATO E COSTO DI CONVERSIONE, riportata parola per parola. Nessun'altra cifra e' valida.</w:t>
       </w:r>
       <w:r>
         <w:br/>
@@ -4697,7 +4697,7 @@
     </w:p>
     <w:p>
       <w:r>
-        <w:t>Immagini: Se dispone solo di immagini raster (JPEG, PNG), applicheremo un costo aggiuntivo di 25 euro a immagine (a logo) da convertire in formato vettoriale. Tuttavia, per immagini semplici e lineari, il nostro software è in grado di elaborarle senza costi aggiuntivi.</w:t>
+        <w:t>Immagini: sul formato e sul costo della conversione si risponde solo con la frase del blocco IMMAGINI E LOGHI: FORMATO E COSTO DI CONVERSIONE, riportata parola per parola. Non usare altre cifre e non promettere lavorazioni gratuite: e' la frase stessa a dire cosa valutiamo e quando lo confermiamo.</w:t>
       </w:r>
     </w:p>
     <w:p>
@@ -5536,7 +5536,7 @@
       </w:r>
       <w:r>
         <w:br/>
-        <w:t>• Se il cliente ha solo file raster (JPG, PNG) li accettiamo lo stesso e la conversione la facciamo noi, con un costo di 25 euro a immagine (a logo): un ordine non viene mai rifiutato perche' il cliente ha solo un JPEG</w:t>
+        <w:t>• Sul formato dei file e sul costo della conversione delle immagini raster vale una sola risposta: la frase del blocco IMMAGINI E LOGHI: FORMATO E COSTO DI CONVERSIONE, riportata parola per parola. Nessun'altra cifra e' valida.</w:t>
       </w:r>
       <w:r>
         <w:br/>
@@ -6499,7 +6499,7 @@
     </w:p>
     <w:p>
       <w:r>
-        <w:t>Immagini: Se dispone solo di immagini raster (JPEG, PNG), applicheremo un costo aggiuntivo di 25 euro a immagine (a logo) da convertire in formato vettoriale. Tuttavia, per immagini semplici e lineari, il nostro software è in grado di elaborarle senza costi aggiuntivi.</w:t>
+        <w:t>Immagini: sul formato e sul costo della conversione si risponde solo con la frase del blocco IMMAGINI E LOGHI: FORMATO E COSTO DI CONVERSIONE, riportata parola per parola. Non usare altre cifre e non promettere lavorazioni gratuite: e' la frase stessa a dire cosa valutiamo e quando lo confermiamo.</w:t>
       </w:r>
     </w:p>
     <w:p>
@@ -7340,7 +7340,7 @@
       </w:r>
       <w:r>
         <w:br/>
-        <w:t>• Se il cliente ha solo file raster (JPG, PNG) li accettiamo lo stesso e la conversione la facciamo noi, con un costo di 25 euro a immagine (a logo): un ordine non viene mai rifiutato perche' il cliente ha solo un JPEG</w:t>
+        <w:t>• Sul formato dei file e sul costo della conversione delle immagini raster vale una sola risposta: la frase del blocco IMMAGINI E LOGHI: FORMATO E COSTO DI CONVERSIONE, riportata parola per parola. Nessun'altra cifra e' valida.</w:t>
       </w:r>
       <w:r>
         <w:br/>
@@ -8228,14 +8228,27 @@
         <w:t>Rimborsi: al cliente retail si rimborsa in denaro senza problemi, se e' il rimborso che chiede. Al cliente B2B invece non si rimborsa in denaro: si emette un coupon che potra' usare sull'ordine successivo.</w:t>
         <w:br/>
         <w:br/>
-        <w:t>File grafici: il file che chiediamo e' il vettoriale. Se il cliente non ce l'ha, il file raster (JPEG, PNG) si accetta lo stesso e la conversione la facciamo noi, con un costo di 25 euro a immagine, cioe' a logo: tre loghi raster sono tre conversioni, 75 euro. Non rifiutare mai un ordine perche' il cliente ha solo un JPEG: si propone la conversione.</w:t>
-        <w:br/>
-        <w:t>Come dirlo al cliente, anche al cliente business: "e' previsto un costo di 25 euro a immagine, a logo. Se le immagini sono piu' d'una, di volta in volta valutiamo se c'e' la possibilita' di un forfait in base al tipo di progetto."</w:t>
-        <w:br/>
-        <w:t>Il forfait (informazione interna: rispondi solo allo staff): quando le immagini sono piu' di una si puo' valutare un forfait, caso per caso, in base al progetto. La decisione sullo sconto la prende chi gestisce l'ordine, non il bot: al cliente il forfait non si promette mai come se fosse un prezzo di listino, gli si dice che lo valutiamo.</w:t>
+        <w:t>File grafici: il file che chiediamo e' il vettoriale. Se il cliente non ce l'ha, il raster (JPEG, PNG) si accetta lo stesso e non si rifiuta mai un ordine per questo. Sul formato e sul costo della conversione non rispondere di tua iniziativa: vale solo la frase del blocco IMMAGINI E LOGHI: FORMATO E COSTO DI CONVERSIONE, da riportare parola per parola.</w:t>
         <w:br/>
         <w:br/>
         <w:t>Tempi di produzione dei custom: 45-60 giorni lavorativi dal pagamento che fa partire i lavori (il saldo totale sotto i 1000 euro, l'acconto del 50% sopra). L'ok del cliente sulla grafica non allunga questi tempi e non va sommato: l'approvazione della grafica avviene sempre PRIMA, perche' senza quella non si procede nemmeno a fare il preventivo.</w:t>
+      </w:r>
+    </w:p>
+    <w:p/>
+    <w:p>
+      <w:r>
+        <w:t>IMMAGINI E LOGHI: FORMATO E COSTO DI CONVERSIONE</w:t>
+        <w:br/>
+        <w:br/>
+        <w:t>Questa e' l'unica risposta sul formato delle immagini e sul costo della conversione, e vale per tutti allo stesso modo: staff, clienti business, clienti privati. Si riporta integra e alla lettera ogni volta che qualcuno chiede come inviare le immagini, in che formato, o cosa succede se manda un JPEG o un PNG. Non si riassume, non se ne cita un pezzo solo, non si riformula. Nessun'altra cifra sulla conversione e' valida: fuori da qui non ce ne sono.</w:t>
+        <w:br/>
+        <w:br/>
+        <w:t>Frase da riportare parola per parola:</w:t>
+        <w:br/>
+        <w:t>"Le immagini vanno inviate in formato vettoriale (.AI, .EPS, .PDF, .SVG). Se hai solo un file raster (JPEG, PNG) lo accettiamo lo stesso: la conversione la facciamo noi e il costo e' di 25 euro a immagine. Se l'immagine e' semplice e lineare il nostro software riesce spesso a elaborarla senza costi aggiuntivi, e se le immagini sono piu' di una valutiamo un forfait in base al progetto: in entrambi i casi te lo confermiamo noi dopo aver visto i file, prima di procedere."</w:t>
+        <w:br/>
+        <w:br/>
+        <w:t>Chi decide (informazione interna: rispondi solo allo staff): se un'immagine sia semplice e lineare, e se applicare un forfait quando le immagini sono piu' d'una, lo stabilisce chi gestisce l'ordine dopo aver visto i file. Non lo decide il bot e non lo anticipa: la frase dice che lo confermiamo dopo aver visto i file, e si ferma li'.</w:t>
       </w:r>
     </w:p>
   </w:body>

</xml_diff>